<commit_message>
Corrige dependencia circular em ConfiguracaoSeguranca
Injeta JwtFiltroAutenticacao como parametro do metodo @Bean
securityFilterChain em vez de via construtor da classe, evitando
BeanCurrentlyInCreationException (o filtro depende, via
UsuarioService, do PasswordEncoder definido na propria classe).
Atualiza o material de apoio com a explicacao do problema.

Co-Authored-By: Claude Sonnet 5 <noreply@anthropic.com>
</commit_message>
<xml_diff>
--- a/docs/seguranca_jwt_financeiro26.docx
+++ b/docs/seguranca_jwt_financeiro26.docx
@@ -3639,7 +3639,26 @@
           <w:sz w:val="19"/>
           <w:szCs w:val="19"/>
         </w:rPr>
-        <w:t xml:space="preserve">public SecurityFilterChain securityFilterChain(HttpSecurity http) {</w:t>
+        <w:t xml:space="preserve">public SecurityFilterChain securityFilterChain(</w:t>
+      </w:r>
+    </w:p>
+    <w:p>
+      <w:pPr>
+        <w:pBdr>
+          <w:left w:val="single" w:color="D9D9D9" w:sz="12" w:space="6"/>
+          <w:right w:val="single" w:color="D9D9D9" w:sz="6" w:space="4"/>
+        </w:pBdr>
+        <w:shd w:fill="F2F2F2" w:color="auto" w:val="clear"/>
+        <w:spacing w:after="0" w:line="264"/>
+      </w:pPr>
+      <w:r>
+        <w:rPr>
+          <w:rFonts w:ascii="Consolas" w:cs="Consolas" w:eastAsia="Consolas" w:hAnsi="Consolas"/>
+          <w:color w:val="333333"/>
+          <w:sz w:val="19"/>
+          <w:szCs w:val="19"/>
+        </w:rPr>
+        <w:t xml:space="preserve">        HttpSecurity http, JwtFiltroAutenticacao jwtRequestFilter) {</w:t>
       </w:r>
     </w:p>
     <w:p>
@@ -3888,6 +3907,38 @@
           <w:szCs w:val="19"/>
         </w:rPr>
         <w:t xml:space="preserve">}</w:t>
+      </w:r>
+    </w:p>
+    <w:p>
+      <w:pPr>
+        <w:pBdr>
+          <w:top w:val="single" w:color="E8C547" w:sz="4" w:space="4"/>
+          <w:bottom w:val="single" w:color="E8C547" w:sz="4" w:space="4"/>
+          <w:left w:val="single" w:color="E8C547" w:sz="18" w:space="8"/>
+          <w:right w:val="single" w:color="E8C547" w:sz="4" w:space="4"/>
+        </w:pBdr>
+        <w:shd w:fill="FFF4CE" w:color="auto" w:val="clear"/>
+        <w:spacing w:after="240" w:before="120" w:line="280"/>
+      </w:pPr>
+      <w:r>
+        <w:rPr>
+          <w:rFonts w:ascii="Calibri" w:cs="Calibri" w:eastAsia="Calibri" w:hAnsi="Calibri"/>
+          <w:b/>
+          <w:bCs/>
+          <w:color w:val="7A5B00"/>
+          <w:sz w:val="21"/>
+          <w:szCs w:val="21"/>
+        </w:rPr>
+        <w:t xml:space="preserve">Por que jwtRequestFilter é parâmetro do método, e não do construtor da classe?  </w:t>
+      </w:r>
+      <w:r>
+        <w:rPr>
+          <w:rFonts w:ascii="Calibri" w:cs="Calibri" w:eastAsia="Calibri" w:hAnsi="Calibri"/>
+          <w:color w:val="594100"/>
+          <w:sz w:val="21"/>
+          <w:szCs w:val="21"/>
+        </w:rPr>
+        <w:t xml:space="preserve">a primeira versão desta classe recebia o JwtFiltroAutenticacao pelo construtor de ConfiguracaoSeguranca. Isso causa um ciclo: para construir ConfiguracaoSeguranca, o Spring precisa primeiro instanciar o JwtFiltroAutenticacao (que depende de UsuarioService, que depende do bean PasswordEncoder — definido dentro dessa própria classe, ainda em construção), resultando em BeanCurrentlyInCreationException. Movendo o JwtFiltroAutenticacao para parâmetro do método @Bean securityFilterChain, o Spring resolve essa dependência só na hora de criar o SecurityFilterChain — quando os demais beans (como o passwordEncoder) já existem — quebrando o ciclo.</w:t>
       </w:r>
     </w:p>
     <w:tbl>
@@ -6849,6 +6900,62 @@
           </w:p>
         </w:tc>
       </w:tr>
+      <w:tr>
+        <w:tc>
+          <w:tcPr>
+            <w:tcW w:type="dxa" w:w="3600"/>
+            <w:tcMar>
+              <w:top w:type="dxa" w:w="90"/>
+              <w:left w:type="dxa" w:w="120"/>
+              <w:bottom w:type="dxa" w:w="90"/>
+              <w:right w:type="dxa" w:w="120"/>
+            </w:tcMar>
+          </w:tcPr>
+          <w:p>
+            <w:pPr>
+              <w:jc w:val="left"/>
+            </w:pPr>
+            <w:r>
+              <w:rPr>
+                <w:rFonts w:ascii="Calibri" w:cs="Calibri" w:eastAsia="Calibri" w:hAnsi="Calibri"/>
+                <w:b w:val="false"/>
+                <w:bCs w:val="false"/>
+                <w:color w:val="262626"/>
+                <w:sz w:val="21"/>
+                <w:szCs w:val="21"/>
+              </w:rPr>
+              <w:t xml:space="preserve">App não sobe: BeanCurrentlyInCreationException envolvendo ConfiguracaoSeguranca</w:t>
+            </w:r>
+          </w:p>
+        </w:tc>
+        <w:tc>
+          <w:tcPr>
+            <w:tcW w:type="dxa" w:w="6000"/>
+            <w:tcMar>
+              <w:top w:type="dxa" w:w="90"/>
+              <w:left w:type="dxa" w:w="120"/>
+              <w:bottom w:type="dxa" w:w="90"/>
+              <w:right w:type="dxa" w:w="120"/>
+            </w:tcMar>
+          </w:tcPr>
+          <w:p>
+            <w:pPr>
+              <w:jc w:val="left"/>
+            </w:pPr>
+            <w:r>
+              <w:rPr>
+                <w:rFonts w:ascii="Calibri" w:cs="Calibri" w:eastAsia="Calibri" w:hAnsi="Calibri"/>
+                <w:b w:val="false"/>
+                <w:bCs w:val="false"/>
+                <w:color w:val="262626"/>
+                <w:sz w:val="21"/>
+                <w:szCs w:val="21"/>
+              </w:rPr>
+              <w:t xml:space="preserve">Dependência circular: o JwtFiltroAutenticacao foi injetado pelo construtor de ConfiguracaoSeguranca, mas ele depende (via UsuarioService) do PasswordEncoder que é definido dentro dessa mesma classe. Solução: injetar o filtro como parâmetro do método @Bean securityFilterChain(...), não do construtor da classe.</w:t>
+            </w:r>
+          </w:p>
+        </w:tc>
+      </w:tr>
     </w:tbl>
     <w:p>
       <w:pPr>

</xml_diff>